<commit_message>
Ancla todo el formulario del telegrama a la pagina
El modelo traia el formulario partido en tres sistemas de coordenadas:
una parte anclada a la pagina y otras dos ancladas a parrafos (los
banners con las filas 1 y 2, y el recuadro del cuerpo). Como la posicion
de un parrafo depende de como cada programa calcule el alto del texto
anterior, esas partes caian distinto en cada visor: en Google Docs el
encabezado se corria unos 2 cm y en Pages el recuadro se subia tapando
la fila de Localidad/Provincia, asi que los datos nunca podian quedar
fijos sobre su renglon.

Se normaliza la plantilla dejando las 144 anclas en coordenadas de
pagina (plantillas/normalizar_modelo.py deja asentado como se hizo), y
el generador pasa a trabajar en un unico sistema. Verificado exportando
a PDF con Pages: las cuatro filas caen sobre su renglon y el cuerpo
entra dentro del recuadro.
</commit_message>
<xml_diff>
--- a/plantillas/modelo_telegrama.docx
+++ b/plantillas/modelo_telegrama.docx
@@ -19204,11 +19204,11 @@
             <w:drawing>
               <wp:anchor allowOverlap="1" behindDoc="1" distB="0" distT="0" distL="0" distR="0" hidden="0" layoutInCell="1" locked="0" relativeHeight="0" simplePos="0">
                 <wp:simplePos x="0" y="0"/>
-                <wp:positionH relativeFrom="column">
-                  <wp:posOffset>74295</wp:posOffset>
+                <wp:positionH relativeFrom="page">
+                  <wp:posOffset>391095</wp:posOffset>
                 </wp:positionH>
-                <wp:positionV relativeFrom="paragraph">
-                  <wp:posOffset>-410206</wp:posOffset>
+                <wp:positionV relativeFrom="page">
+                  <wp:posOffset>345794</wp:posOffset>
                 </wp:positionV>
                 <wp:extent cx="3205480" cy="309245"/>
                 <wp:effectExtent b="0" l="0" r="0" t="0"/>
@@ -24574,11 +24574,11 @@
             <w:drawing>
               <wp:anchor allowOverlap="1" behindDoc="1" distB="0" distT="0" distL="0" distR="0" hidden="0" layoutInCell="1" locked="0" relativeHeight="0" simplePos="0">
                 <wp:simplePos x="0" y="0"/>
-                <wp:positionH relativeFrom="column">
-                  <wp:posOffset>74295</wp:posOffset>
+                <wp:positionH relativeFrom="page">
+                  <wp:posOffset>391095</wp:posOffset>
                 </wp:positionH>
-                <wp:positionV relativeFrom="paragraph">
-                  <wp:posOffset>-410206</wp:posOffset>
+                <wp:positionV relativeFrom="page">
+                  <wp:posOffset>345794</wp:posOffset>
                 </wp:positionV>
                 <wp:extent cx="3205480" cy="309245"/>
                 <wp:effectExtent b="0" l="0" r="0" t="0"/>
@@ -24620,11 +24620,11 @@
             <w:drawing>
               <wp:anchor allowOverlap="1" behindDoc="1" distB="0" distT="0" distL="0" distR="0" hidden="0" layoutInCell="1" locked="0" relativeHeight="0" simplePos="0">
                 <wp:simplePos x="0" y="0"/>
-                <wp:positionH relativeFrom="column">
-                  <wp:posOffset>73025</wp:posOffset>
+                <wp:positionH relativeFrom="page">
+                  <wp:posOffset>389825</wp:posOffset>
                 </wp:positionH>
-                <wp:positionV relativeFrom="paragraph">
-                  <wp:posOffset>1094740</wp:posOffset>
+                <wp:positionV relativeFrom="page">
+                  <wp:posOffset>1850740</wp:posOffset>
                 </wp:positionV>
                 <wp:extent cx="3202940" cy="145415"/>
                 <wp:effectExtent b="0" l="0" r="0" t="0"/>
@@ -24811,11 +24811,11 @@
             <w:drawing>
               <wp:anchor allowOverlap="1" behindDoc="1" distB="0" distT="0" distL="0" distR="0" hidden="0" layoutInCell="1" locked="0" relativeHeight="0" simplePos="0">
                 <wp:simplePos x="0" y="0"/>
-                <wp:positionH relativeFrom="column">
-                  <wp:posOffset>73025</wp:posOffset>
+                <wp:positionH relativeFrom="page">
+                  <wp:posOffset>389825</wp:posOffset>
                 </wp:positionH>
-                <wp:positionV relativeFrom="paragraph">
-                  <wp:posOffset>1094740</wp:posOffset>
+                <wp:positionV relativeFrom="page">
+                  <wp:posOffset>1850740</wp:posOffset>
                 </wp:positionV>
                 <wp:extent cx="3202940" cy="145415"/>
                 <wp:effectExtent b="0" l="0" r="0" t="0"/>
@@ -24857,11 +24857,11 @@
             <w:drawing>
               <wp:anchor allowOverlap="1" behindDoc="1" distB="0" distT="0" distL="0" distR="0" hidden="0" layoutInCell="1" locked="0" relativeHeight="0" simplePos="0">
                 <wp:simplePos x="0" y="0"/>
-                <wp:positionH relativeFrom="column">
-                  <wp:posOffset>72389</wp:posOffset>
+                <wp:positionH relativeFrom="page">
+                  <wp:posOffset>389189</wp:posOffset>
                 </wp:positionH>
-                <wp:positionV relativeFrom="paragraph">
-                  <wp:posOffset>730250</wp:posOffset>
+                <wp:positionV relativeFrom="page">
+                  <wp:posOffset>1486250</wp:posOffset>
                 </wp:positionV>
                 <wp:extent cx="3203575" cy="147320"/>
                 <wp:effectExtent b="0" l="0" r="0" t="0"/>
@@ -25048,11 +25048,11 @@
             <w:drawing>
               <wp:anchor allowOverlap="1" behindDoc="1" distB="0" distT="0" distL="0" distR="0" hidden="0" layoutInCell="1" locked="0" relativeHeight="0" simplePos="0">
                 <wp:simplePos x="0" y="0"/>
-                <wp:positionH relativeFrom="column">
-                  <wp:posOffset>72389</wp:posOffset>
+                <wp:positionH relativeFrom="page">
+                  <wp:posOffset>389189</wp:posOffset>
                 </wp:positionH>
-                <wp:positionV relativeFrom="paragraph">
-                  <wp:posOffset>730250</wp:posOffset>
+                <wp:positionV relativeFrom="page">
+                  <wp:posOffset>1486250</wp:posOffset>
                 </wp:positionV>
                 <wp:extent cx="3203575" cy="147320"/>
                 <wp:effectExtent b="0" l="0" r="0" t="0"/>
@@ -25094,11 +25094,11 @@
             <w:drawing>
               <wp:anchor allowOverlap="1" behindDoc="1" distB="0" distT="0" distL="0" distR="0" hidden="0" layoutInCell="1" locked="0" relativeHeight="0" simplePos="0">
                 <wp:simplePos x="0" y="0"/>
-                <wp:positionH relativeFrom="column">
-                  <wp:posOffset>3633470</wp:posOffset>
+                <wp:positionH relativeFrom="page">
+                  <wp:posOffset>3950270</wp:posOffset>
                 </wp:positionH>
-                <wp:positionV relativeFrom="paragraph">
-                  <wp:posOffset>1094740</wp:posOffset>
+                <wp:positionV relativeFrom="page">
+                  <wp:posOffset>1850740</wp:posOffset>
                 </wp:positionV>
                 <wp:extent cx="3208655" cy="117475"/>
                 <wp:effectExtent b="0" l="0" r="0" t="0"/>
@@ -27587,11 +27587,11 @@
             <w:drawing>
               <wp:anchor allowOverlap="1" behindDoc="1" distB="0" distT="0" distL="0" distR="0" hidden="0" layoutInCell="1" locked="0" relativeHeight="0" simplePos="0">
                 <wp:simplePos x="0" y="0"/>
-                <wp:positionH relativeFrom="column">
-                  <wp:posOffset>3633470</wp:posOffset>
+                <wp:positionH relativeFrom="page">
+                  <wp:posOffset>3950270</wp:posOffset>
                 </wp:positionH>
-                <wp:positionV relativeFrom="paragraph">
-                  <wp:posOffset>1094740</wp:posOffset>
+                <wp:positionV relativeFrom="page">
+                  <wp:posOffset>1850740</wp:posOffset>
                 </wp:positionV>
                 <wp:extent cx="3208655" cy="117475"/>
                 <wp:effectExtent b="0" l="0" r="0" t="0"/>
@@ -27633,11 +27633,11 @@
             <w:drawing>
               <wp:anchor allowOverlap="1" behindDoc="1" distB="0" distT="0" distL="0" distR="0" hidden="0" layoutInCell="1" locked="0" relativeHeight="0" simplePos="0">
                 <wp:simplePos x="0" y="0"/>
-                <wp:positionH relativeFrom="column">
-                  <wp:posOffset>3633470</wp:posOffset>
+                <wp:positionH relativeFrom="page">
+                  <wp:posOffset>3950270</wp:posOffset>
                 </wp:positionH>
-                <wp:positionV relativeFrom="paragraph">
-                  <wp:posOffset>730250</wp:posOffset>
+                <wp:positionV relativeFrom="page">
+                  <wp:posOffset>1486250</wp:posOffset>
                 </wp:positionV>
                 <wp:extent cx="3208655" cy="147320"/>
                 <wp:effectExtent b="0" l="0" r="0" t="0"/>
@@ -27824,11 +27824,11 @@
             <w:drawing>
               <wp:anchor allowOverlap="1" behindDoc="1" distB="0" distT="0" distL="0" distR="0" hidden="0" layoutInCell="1" locked="0" relativeHeight="0" simplePos="0">
                 <wp:simplePos x="0" y="0"/>
-                <wp:positionH relativeFrom="column">
-                  <wp:posOffset>3633470</wp:posOffset>
+                <wp:positionH relativeFrom="page">
+                  <wp:posOffset>3950270</wp:posOffset>
                 </wp:positionH>
-                <wp:positionV relativeFrom="paragraph">
-                  <wp:posOffset>730250</wp:posOffset>
+                <wp:positionV relativeFrom="page">
+                  <wp:posOffset>1486250</wp:posOffset>
                 </wp:positionV>
                 <wp:extent cx="3208655" cy="147320"/>
                 <wp:effectExtent b="0" l="0" r="0" t="0"/>
@@ -27870,11 +27870,11 @@
             <w:drawing>
               <wp:anchor allowOverlap="1" behindDoc="1" distB="0" distT="0" distL="0" distR="0" hidden="0" layoutInCell="1" locked="0" relativeHeight="0" simplePos="0">
                 <wp:simplePos x="0" y="0"/>
-                <wp:positionH relativeFrom="column">
-                  <wp:posOffset>74295</wp:posOffset>
+                <wp:positionH relativeFrom="page">
+                  <wp:posOffset>391095</wp:posOffset>
                 </wp:positionH>
-                <wp:positionV relativeFrom="paragraph">
-                  <wp:posOffset>294005</wp:posOffset>
+                <wp:positionV relativeFrom="page">
+                  <wp:posOffset>1050005</wp:posOffset>
                 </wp:positionV>
                 <wp:extent cx="3202305" cy="148590"/>
                 <wp:effectExtent b="0" l="0" r="0" t="0"/>
@@ -30655,11 +30655,11 @@
             <w:drawing>
               <wp:anchor allowOverlap="1" behindDoc="1" distB="0" distT="0" distL="0" distR="0" hidden="0" layoutInCell="1" locked="0" relativeHeight="0" simplePos="0">
                 <wp:simplePos x="0" y="0"/>
-                <wp:positionH relativeFrom="column">
-                  <wp:posOffset>74295</wp:posOffset>
+                <wp:positionH relativeFrom="page">
+                  <wp:posOffset>391095</wp:posOffset>
                 </wp:positionH>
-                <wp:positionV relativeFrom="paragraph">
-                  <wp:posOffset>294005</wp:posOffset>
+                <wp:positionV relativeFrom="page">
+                  <wp:posOffset>1050005</wp:posOffset>
                 </wp:positionV>
                 <wp:extent cx="3202305" cy="148590"/>
                 <wp:effectExtent b="0" l="0" r="0" t="0"/>
@@ -30701,11 +30701,11 @@
             <w:drawing>
               <wp:anchor allowOverlap="1" behindDoc="1" distB="0" distT="0" distL="0" distR="0" hidden="0" layoutInCell="1" locked="0" relativeHeight="0" simplePos="0">
                 <wp:simplePos x="0" y="0"/>
-                <wp:positionH relativeFrom="column">
-                  <wp:posOffset>3634740</wp:posOffset>
+                <wp:positionH relativeFrom="page">
+                  <wp:posOffset>3951540</wp:posOffset>
                 </wp:positionH>
-                <wp:positionV relativeFrom="paragraph">
-                  <wp:posOffset>294005</wp:posOffset>
+                <wp:positionV relativeFrom="page">
+                  <wp:posOffset>1050005</wp:posOffset>
                 </wp:positionV>
                 <wp:extent cx="3208020" cy="148590"/>
                 <wp:effectExtent b="0" l="0" r="0" t="0"/>
@@ -33264,11 +33264,11 @@
             <w:drawing>
               <wp:anchor allowOverlap="1" behindDoc="1" distB="0" distT="0" distL="0" distR="0" hidden="0" layoutInCell="1" locked="0" relativeHeight="0" simplePos="0">
                 <wp:simplePos x="0" y="0"/>
-                <wp:positionH relativeFrom="column">
-                  <wp:posOffset>3634740</wp:posOffset>
+                <wp:positionH relativeFrom="page">
+                  <wp:posOffset>3951540</wp:posOffset>
                 </wp:positionH>
-                <wp:positionV relativeFrom="paragraph">
-                  <wp:posOffset>294005</wp:posOffset>
+                <wp:positionV relativeFrom="page">
+                  <wp:posOffset>1050005</wp:posOffset>
                 </wp:positionV>
                 <wp:extent cx="3208020" cy="148590"/>
                 <wp:effectExtent b="0" l="0" r="0" t="0"/>
@@ -33514,11 +33514,11 @@
             <w:drawing>
               <wp:anchor allowOverlap="1" behindDoc="0" distB="0" distT="0" distL="114300" distR="114300" hidden="0" layoutInCell="1" locked="0" relativeHeight="0" simplePos="0">
                 <wp:simplePos x="0" y="0"/>
-                <wp:positionH relativeFrom="column">
-                  <wp:posOffset>74931</wp:posOffset>
+                <wp:positionH relativeFrom="page">
+                  <wp:posOffset>391731</wp:posOffset>
                 </wp:positionH>
-                <wp:positionV relativeFrom="paragraph">
-                  <wp:posOffset>23780</wp:posOffset>
+                <wp:positionV relativeFrom="page">
+                  <wp:posOffset>3094580</wp:posOffset>
                 </wp:positionV>
                 <wp:extent cx="6794500" cy="5965438"/>
                 <wp:effectExtent b="0" l="0" r="0" t="0"/>
@@ -33575,11 +33575,11 @@
             <w:drawing>
               <wp:anchor allowOverlap="1" behindDoc="0" distB="0" distT="0" distL="114300" distR="114300" hidden="0" layoutInCell="1" locked="0" relativeHeight="0" simplePos="0">
                 <wp:simplePos x="0" y="0"/>
-                <wp:positionH relativeFrom="column">
-                  <wp:posOffset>74931</wp:posOffset>
+                <wp:positionH relativeFrom="page">
+                  <wp:posOffset>391731</wp:posOffset>
                 </wp:positionH>
-                <wp:positionV relativeFrom="paragraph">
-                  <wp:posOffset>23780</wp:posOffset>
+                <wp:positionV relativeFrom="page">
+                  <wp:posOffset>3094580</wp:posOffset>
                 </wp:positionV>
                 <wp:extent cx="6794500" cy="5965438"/>
                 <wp:effectExtent b="0" l="0" r="0" t="0"/>

</xml_diff>